<commit_message>
docs: add Appendix A sections, admin table, Appendix V annotation
https://claude.ai/code/session_01WBcR9y3fb3gMXiFrPhvoBr
</commit_message>
<xml_diff>
--- a/docs/reports/Приложения_и_характеристики.docx
+++ b/docs/reports/Приложения_и_характеристики.docx
@@ -2278,6 +2278,2183 @@
         <w:t>Суммарный объём исходного кода составляет около 550 КБ, что соответствует масштабу полнофункционального веб-приложения. Наибольший вклад вносят клиентские стили (style.css — 58 КБ) и модули панели администратора (js/admin.js — 48 КБ, css/cabinet.css — 33 КБ), реализующие наиболее сложную бизнес-логику на стороне клиента.</w:t>
       </w:r>
     </w:p>
+    <w:p>
+      <w:pPr>
+        <w:spacing w:before="0" w:after="0"/>
+      </w:pPr>
+      <w:r>
+        <w:br w:type="page"/>
+      </w:r>
+    </w:p>
+    <w:p>
+      <w:pPr>
+        <w:spacing w:line="360" w:lineRule="auto" w:before="0" w:after="80"/>
+        <w:ind w:firstLine="0"/>
+        <w:jc w:val="right"/>
+      </w:pPr>
+      <w:r>
+        <w:rPr>
+          <w:rFonts w:ascii="Times New Roman" w:hAnsi="Times New Roman" w:cs="Times New Roman" w:eastAsia="Times New Roman"/>
+          <w:b/>
+          <w:i w:val="0"/>
+          <w:color w:val="000000"/>
+          <w:sz w:val="28"/>
+        </w:rPr>
+        <w:t>ПРИЛОЖЕНИЕ А</w:t>
+      </w:r>
+    </w:p>
+    <w:p>
+      <w:pPr>
+        <w:spacing w:line="360" w:lineRule="auto" w:before="0" w:after="80"/>
+        <w:ind w:firstLine="0"/>
+        <w:jc w:val="center"/>
+      </w:pPr>
+      <w:r>
+        <w:rPr>
+          <w:rFonts w:ascii="Times New Roman" w:hAnsi="Times New Roman" w:cs="Times New Roman" w:eastAsia="Times New Roman"/>
+          <w:b/>
+          <w:i w:val="0"/>
+          <w:color w:val="000000"/>
+          <w:sz w:val="28"/>
+        </w:rPr>
+        <w:t>ТЕКСТ ПРОГРАММЫ</w:t>
+      </w:r>
+    </w:p>
+    <w:p>
+      <w:pPr>
+        <w:spacing w:line="360" w:lineRule="auto" w:before="80" w:after="80"/>
+        <w:ind w:firstLine="0"/>
+        <w:jc w:val="center"/>
+      </w:pPr>
+      <w:r>
+        <w:rPr>
+          <w:rFonts w:ascii="Times New Roman" w:hAnsi="Times New Roman" w:cs="Times New Roman" w:eastAsia="Times New Roman"/>
+          <w:b/>
+          <w:i w:val="0"/>
+          <w:color w:val="000000"/>
+          <w:sz w:val="28"/>
+        </w:rPr>
+        <w:t>АННОТАЦИЯ</w:t>
+      </w:r>
+    </w:p>
+    <w:p>
+      <w:pPr>
+        <w:spacing w:line="360" w:lineRule="auto" w:before="0" w:after="0"/>
+        <w:ind w:firstLine="709"/>
+        <w:jc w:val="both"/>
+      </w:pPr>
+      <w:r>
+        <w:rPr>
+          <w:rFonts w:ascii="Times New Roman" w:hAnsi="Times New Roman" w:cs="Times New Roman" w:eastAsia="Times New Roman"/>
+          <w:b w:val="0"/>
+          <w:i w:val="0"/>
+          <w:color w:val="000000"/>
+          <w:sz w:val="28"/>
+        </w:rPr>
+        <w:t>Документ является приложением к дипломной работе по теме «Разработка веб-приложения для онлайн-записи в тату-студию REMNANT». Приложение содержит перечень программных модулей с указанием функционального назначения каждого, а также описание среды разработки и применяемых технологий. Документ адресован специалистам, обеспечивающим сопровождение и развитие веб-приложения после ввода в эксплуатацию.</w:t>
+      </w:r>
+    </w:p>
+    <w:p>
+      <w:pPr>
+        <w:spacing w:line="360" w:lineRule="auto" w:before="160" w:after="80"/>
+        <w:ind w:firstLine="0"/>
+        <w:jc w:val="center"/>
+      </w:pPr>
+      <w:r>
+        <w:rPr>
+          <w:rFonts w:ascii="Times New Roman" w:hAnsi="Times New Roman" w:cs="Times New Roman" w:eastAsia="Times New Roman"/>
+          <w:b/>
+          <w:i w:val="0"/>
+          <w:color w:val="000000"/>
+          <w:sz w:val="28"/>
+        </w:rPr>
+        <w:t>ВВЕДЕНИЕ</w:t>
+      </w:r>
+    </w:p>
+    <w:p>
+      <w:pPr>
+        <w:spacing w:line="360" w:lineRule="auto" w:before="0" w:after="0"/>
+        <w:ind w:firstLine="709"/>
+        <w:jc w:val="both"/>
+      </w:pPr>
+      <w:r>
+        <w:rPr>
+          <w:rFonts w:ascii="Times New Roman" w:hAnsi="Times New Roman" w:cs="Times New Roman" w:eastAsia="Times New Roman"/>
+          <w:b w:val="0"/>
+          <w:i w:val="0"/>
+          <w:color w:val="000000"/>
+          <w:sz w:val="28"/>
+        </w:rPr>
+        <w:t>В качестве среды написания исходного кода применён редактор Visual Studio Code. Встроенная интеграция с Git и удобный отладчик Node.js сделали редактор основным рабочим инструментом на протяжении всей разработки.</w:t>
+      </w:r>
+    </w:p>
+    <w:p>
+      <w:pPr>
+        <w:spacing w:line="360" w:lineRule="auto" w:before="0" w:after="0"/>
+        <w:ind w:firstLine="709"/>
+        <w:jc w:val="both"/>
+      </w:pPr>
+      <w:r>
+        <w:rPr>
+          <w:rFonts w:ascii="Times New Roman" w:hAnsi="Times New Roman" w:cs="Times New Roman" w:eastAsia="Times New Roman"/>
+          <w:b w:val="0"/>
+          <w:i w:val="0"/>
+          <w:color w:val="000000"/>
+          <w:sz w:val="28"/>
+        </w:rPr>
+        <w:t>Для построения интерактивной 3D-сцены выбрана библиотека Three.js — наиболее распространённое решение для трёхмерной графики на JavaScript поверх WebGL. В качестве вспомогательного инструмента анимаций задействована платформа GSAP с плагином ScrollTrigger.</w:t>
+      </w:r>
+    </w:p>
+    <w:p>
+      <w:pPr>
+        <w:spacing w:line="360" w:lineRule="auto" w:before="0" w:after="0"/>
+        <w:ind w:firstLine="709"/>
+        <w:jc w:val="both"/>
+      </w:pPr>
+      <w:r>
+        <w:rPr>
+          <w:rFonts w:ascii="Times New Roman" w:hAnsi="Times New Roman" w:cs="Times New Roman" w:eastAsia="Times New Roman"/>
+          <w:b w:val="0"/>
+          <w:i w:val="0"/>
+          <w:color w:val="000000"/>
+          <w:sz w:val="28"/>
+        </w:rPr>
+        <w:t>Серверная сторона построена на платформе Node.js 22 LTS с фреймворком Express. Для работы с MySQL применяется библиотека mysql2. Аутентификация — через JSON Web Token (пакет jsonwebtoken). Хеширование паролей — через bcrypt. Web Push уведомления — через web-push.</w:t>
+      </w:r>
+    </w:p>
+    <w:p>
+      <w:pPr>
+        <w:spacing w:line="360" w:lineRule="auto" w:before="160" w:after="80"/>
+        <w:ind w:firstLine="0"/>
+        <w:jc w:val="center"/>
+      </w:pPr>
+      <w:r>
+        <w:rPr>
+          <w:rFonts w:ascii="Times New Roman" w:hAnsi="Times New Roman" w:cs="Times New Roman" w:eastAsia="Times New Roman"/>
+          <w:b/>
+          <w:i w:val="0"/>
+          <w:color w:val="000000"/>
+          <w:sz w:val="28"/>
+        </w:rPr>
+        <w:t>ПЕРЕЧЕНЬ МОДУЛЕЙ</w:t>
+      </w:r>
+    </w:p>
+    <w:p>
+      <w:pPr>
+        <w:spacing w:line="360" w:lineRule="auto" w:before="0" w:after="80"/>
+        <w:ind w:firstLine="709"/>
+        <w:jc w:val="both"/>
+      </w:pPr>
+      <w:r>
+        <w:rPr>
+          <w:rFonts w:ascii="Times New Roman" w:hAnsi="Times New Roman" w:cs="Times New Roman" w:eastAsia="Times New Roman"/>
+          <w:b w:val="0"/>
+          <w:i w:val="0"/>
+          <w:color w:val="000000"/>
+          <w:sz w:val="28"/>
+        </w:rPr>
+        <w:t>Веб-приложение состоит из набора модулей собственной разработки. Перечень клиентских модулей приведён в таблице А.1.</w:t>
+      </w:r>
+    </w:p>
+    <w:p>
+      <w:pPr>
+        <w:spacing w:line="360" w:lineRule="auto" w:before="120" w:after="60"/>
+        <w:ind w:firstLine="0"/>
+        <w:jc w:val="left"/>
+      </w:pPr>
+      <w:r>
+        <w:rPr>
+          <w:rFonts w:ascii="Times New Roman" w:hAnsi="Times New Roman" w:cs="Times New Roman" w:eastAsia="Times New Roman"/>
+          <w:b w:val="0"/>
+          <w:i w:val="0"/>
+          <w:color w:val="000000"/>
+          <w:sz w:val="28"/>
+        </w:rPr>
+        <w:t>Таблица А.1 — Перечень клиентских модулей</w:t>
+      </w:r>
+    </w:p>
+    <w:tbl>
+      <w:tblPr>
+        <w:tblStyle w:val="TableGrid"/>
+        <w:tblW w:type="auto" w:w="0"/>
+        <w:jc w:val="center"/>
+        <w:tblLook w:firstColumn="1" w:firstRow="1" w:lastColumn="0" w:lastRow="0" w:noHBand="0" w:noVBand="1" w:val="04A0"/>
+      </w:tblPr>
+      <w:tblGrid>
+        <w:gridCol w:w="4561"/>
+        <w:gridCol w:w="4561"/>
+      </w:tblGrid>
+      <w:tr>
+        <w:trPr>
+          <w:cantSplit/>
+        </w:trPr>
+        <w:tc>
+          <w:tcPr>
+            <w:tcW w:type="dxa" w:w="3118"/>
+            <w:vAlign w:val="center"/>
+            <w:shd w:val="clear" w:color="auto" w:fill="D9D9D9"/>
+          </w:tcPr>
+          <w:p>
+            <w:pPr>
+              <w:spacing w:line="360" w:lineRule="auto" w:before="40" w:after="40"/>
+              <w:jc w:val="center"/>
+            </w:pPr>
+            <w:r>
+              <w:rPr>
+                <w:rFonts w:ascii="Times New Roman" w:hAnsi="Times New Roman" w:cs="Times New Roman" w:eastAsia="Times New Roman"/>
+                <w:b/>
+                <w:i w:val="0"/>
+                <w:color w:val="000000"/>
+                <w:sz w:val="24"/>
+              </w:rPr>
+              <w:t>Наименование</w:t>
+            </w:r>
+          </w:p>
+        </w:tc>
+        <w:tc>
+          <w:tcPr>
+            <w:tcW w:type="dxa" w:w="5669"/>
+            <w:vAlign w:val="center"/>
+            <w:shd w:val="clear" w:color="auto" w:fill="D9D9D9"/>
+          </w:tcPr>
+          <w:p>
+            <w:pPr>
+              <w:spacing w:line="360" w:lineRule="auto" w:before="40" w:after="40"/>
+              <w:jc w:val="center"/>
+            </w:pPr>
+            <w:r>
+              <w:rPr>
+                <w:rFonts w:ascii="Times New Roman" w:hAnsi="Times New Roman" w:cs="Times New Roman" w:eastAsia="Times New Roman"/>
+                <w:b/>
+                <w:i w:val="0"/>
+                <w:color w:val="000000"/>
+                <w:sz w:val="24"/>
+              </w:rPr>
+              <w:t>Описание</w:t>
+            </w:r>
+          </w:p>
+        </w:tc>
+      </w:tr>
+      <w:tr>
+        <w:trPr>
+          <w:cantSplit/>
+        </w:trPr>
+        <w:tc>
+          <w:tcPr>
+            <w:tcW w:type="dxa" w:w="3118"/>
+            <w:vAlign w:val="center"/>
+          </w:tcPr>
+          <w:p>
+            <w:pPr>
+              <w:spacing w:line="360" w:lineRule="auto" w:before="20" w:after="20"/>
+              <w:jc w:val="left"/>
+            </w:pPr>
+            <w:r>
+              <w:rPr>
+                <w:rFonts w:ascii="Courier New" w:hAnsi="Courier New" w:cs="Courier New" w:eastAsia="Courier New"/>
+                <w:color w:val="000000"/>
+                <w:sz w:val="22"/>
+              </w:rPr>
+              <w:t>index.html</w:t>
+            </w:r>
+          </w:p>
+        </w:tc>
+        <w:tc>
+          <w:tcPr>
+            <w:tcW w:type="dxa" w:w="5669"/>
+            <w:vAlign w:val="center"/>
+          </w:tcPr>
+          <w:p>
+            <w:pPr>
+              <w:spacing w:line="360" w:lineRule="auto" w:before="20" w:after="20"/>
+              <w:jc w:val="left"/>
+            </w:pPr>
+            <w:r>
+              <w:rPr>
+                <w:rFonts w:ascii="Times New Roman" w:hAnsi="Times New Roman" w:cs="Times New Roman" w:eastAsia="Times New Roman"/>
+                <w:b w:val="0"/>
+                <w:i w:val="0"/>
+                <w:color w:val="000000"/>
+                <w:sz w:val="24"/>
+              </w:rPr>
+              <w:t>Главная страница: hero-секция с 3D-моделью, портфолио, FAQ</w:t>
+            </w:r>
+          </w:p>
+        </w:tc>
+      </w:tr>
+      <w:tr>
+        <w:trPr>
+          <w:cantSplit/>
+        </w:trPr>
+        <w:tc>
+          <w:tcPr>
+            <w:tcW w:type="dxa" w:w="3118"/>
+            <w:vAlign w:val="center"/>
+          </w:tcPr>
+          <w:p>
+            <w:pPr>
+              <w:spacing w:line="360" w:lineRule="auto" w:before="20" w:after="20"/>
+              <w:jc w:val="left"/>
+            </w:pPr>
+            <w:r>
+              <w:rPr>
+                <w:rFonts w:ascii="Courier New" w:hAnsi="Courier New" w:cs="Courier New" w:eastAsia="Courier New"/>
+                <w:color w:val="000000"/>
+                <w:sz w:val="22"/>
+              </w:rPr>
+              <w:t>booking.html</w:t>
+            </w:r>
+          </w:p>
+        </w:tc>
+        <w:tc>
+          <w:tcPr>
+            <w:tcW w:type="dxa" w:w="5669"/>
+            <w:vAlign w:val="center"/>
+          </w:tcPr>
+          <w:p>
+            <w:pPr>
+              <w:spacing w:line="360" w:lineRule="auto" w:before="20" w:after="20"/>
+              <w:jc w:val="left"/>
+            </w:pPr>
+            <w:r>
+              <w:rPr>
+                <w:rFonts w:ascii="Times New Roman" w:hAnsi="Times New Roman" w:cs="Times New Roman" w:eastAsia="Times New Roman"/>
+                <w:b w:val="0"/>
+                <w:i w:val="0"/>
+                <w:color w:val="000000"/>
+                <w:sz w:val="24"/>
+              </w:rPr>
+              <w:t>Страница онлайн-записи: календарь и трёхшаговая форма</w:t>
+            </w:r>
+          </w:p>
+        </w:tc>
+      </w:tr>
+      <w:tr>
+        <w:trPr>
+          <w:cantSplit/>
+        </w:trPr>
+        <w:tc>
+          <w:tcPr>
+            <w:tcW w:type="dxa" w:w="3118"/>
+            <w:vAlign w:val="center"/>
+          </w:tcPr>
+          <w:p>
+            <w:pPr>
+              <w:spacing w:line="360" w:lineRule="auto" w:before="20" w:after="20"/>
+              <w:jc w:val="left"/>
+            </w:pPr>
+            <w:r>
+              <w:rPr>
+                <w:rFonts w:ascii="Courier New" w:hAnsi="Courier New" w:cs="Courier New" w:eastAsia="Courier New"/>
+                <w:color w:val="000000"/>
+                <w:sz w:val="22"/>
+              </w:rPr>
+              <w:t>cabinet.html</w:t>
+            </w:r>
+          </w:p>
+        </w:tc>
+        <w:tc>
+          <w:tcPr>
+            <w:tcW w:type="dxa" w:w="5669"/>
+            <w:vAlign w:val="center"/>
+          </w:tcPr>
+          <w:p>
+            <w:pPr>
+              <w:spacing w:line="360" w:lineRule="auto" w:before="20" w:after="20"/>
+              <w:jc w:val="left"/>
+            </w:pPr>
+            <w:r>
+              <w:rPr>
+                <w:rFonts w:ascii="Times New Roman" w:hAnsi="Times New Roman" w:cs="Times New Roman" w:eastAsia="Times New Roman"/>
+                <w:b w:val="0"/>
+                <w:i w:val="0"/>
+                <w:color w:val="000000"/>
+                <w:sz w:val="24"/>
+              </w:rPr>
+              <w:t>Личный кабинет клиента: история записей, профиль, уведомления</w:t>
+            </w:r>
+          </w:p>
+        </w:tc>
+      </w:tr>
+      <w:tr>
+        <w:trPr>
+          <w:cantSplit/>
+        </w:trPr>
+        <w:tc>
+          <w:tcPr>
+            <w:tcW w:type="dxa" w:w="3118"/>
+            <w:vAlign w:val="center"/>
+          </w:tcPr>
+          <w:p>
+            <w:pPr>
+              <w:spacing w:line="360" w:lineRule="auto" w:before="20" w:after="20"/>
+              <w:jc w:val="left"/>
+            </w:pPr>
+            <w:r>
+              <w:rPr>
+                <w:rFonts w:ascii="Courier New" w:hAnsi="Courier New" w:cs="Courier New" w:eastAsia="Courier New"/>
+                <w:color w:val="000000"/>
+                <w:sz w:val="22"/>
+              </w:rPr>
+              <w:t>admin.html</w:t>
+            </w:r>
+          </w:p>
+        </w:tc>
+        <w:tc>
+          <w:tcPr>
+            <w:tcW w:type="dxa" w:w="5669"/>
+            <w:vAlign w:val="center"/>
+          </w:tcPr>
+          <w:p>
+            <w:pPr>
+              <w:spacing w:line="360" w:lineRule="auto" w:before="20" w:after="20"/>
+              <w:jc w:val="left"/>
+            </w:pPr>
+            <w:r>
+              <w:rPr>
+                <w:rFonts w:ascii="Times New Roman" w:hAnsi="Times New Roman" w:cs="Times New Roman" w:eastAsia="Times New Roman"/>
+                <w:b w:val="0"/>
+                <w:i w:val="0"/>
+                <w:color w:val="000000"/>
+                <w:sz w:val="24"/>
+              </w:rPr>
+              <w:t>Панель администратора: таблица записей, расписание, рассылки</w:t>
+            </w:r>
+          </w:p>
+        </w:tc>
+      </w:tr>
+      <w:tr>
+        <w:trPr>
+          <w:cantSplit/>
+        </w:trPr>
+        <w:tc>
+          <w:tcPr>
+            <w:tcW w:type="dxa" w:w="3118"/>
+            <w:vAlign w:val="center"/>
+          </w:tcPr>
+          <w:p>
+            <w:pPr>
+              <w:spacing w:line="360" w:lineRule="auto" w:before="20" w:after="20"/>
+              <w:jc w:val="left"/>
+            </w:pPr>
+            <w:r>
+              <w:rPr>
+                <w:rFonts w:ascii="Courier New" w:hAnsi="Courier New" w:cs="Courier New" w:eastAsia="Courier New"/>
+                <w:color w:val="000000"/>
+                <w:sz w:val="22"/>
+              </w:rPr>
+              <w:t>master.html</w:t>
+            </w:r>
+          </w:p>
+        </w:tc>
+        <w:tc>
+          <w:tcPr>
+            <w:tcW w:type="dxa" w:w="5669"/>
+            <w:vAlign w:val="center"/>
+          </w:tcPr>
+          <w:p>
+            <w:pPr>
+              <w:spacing w:line="360" w:lineRule="auto" w:before="20" w:after="20"/>
+              <w:jc w:val="left"/>
+            </w:pPr>
+            <w:r>
+              <w:rPr>
+                <w:rFonts w:ascii="Times New Roman" w:hAnsi="Times New Roman" w:cs="Times New Roman" w:eastAsia="Times New Roman"/>
+                <w:b w:val="0"/>
+                <w:i w:val="0"/>
+                <w:color w:val="000000"/>
+                <w:sz w:val="24"/>
+              </w:rPr>
+              <w:t>Страница мастера: подробная информация, портфолио, отзывы</w:t>
+            </w:r>
+          </w:p>
+        </w:tc>
+      </w:tr>
+      <w:tr>
+        <w:trPr>
+          <w:cantSplit/>
+        </w:trPr>
+        <w:tc>
+          <w:tcPr>
+            <w:tcW w:type="dxa" w:w="3118"/>
+            <w:vAlign w:val="center"/>
+          </w:tcPr>
+          <w:p>
+            <w:pPr>
+              <w:spacing w:line="360" w:lineRule="auto" w:before="20" w:after="20"/>
+              <w:jc w:val="left"/>
+            </w:pPr>
+            <w:r>
+              <w:rPr>
+                <w:rFonts w:ascii="Courier New" w:hAnsi="Courier New" w:cs="Courier New" w:eastAsia="Courier New"/>
+                <w:color w:val="000000"/>
+                <w:sz w:val="22"/>
+              </w:rPr>
+              <w:t>faq.html</w:t>
+            </w:r>
+          </w:p>
+        </w:tc>
+        <w:tc>
+          <w:tcPr>
+            <w:tcW w:type="dxa" w:w="5669"/>
+            <w:vAlign w:val="center"/>
+          </w:tcPr>
+          <w:p>
+            <w:pPr>
+              <w:spacing w:line="360" w:lineRule="auto" w:before="20" w:after="20"/>
+              <w:jc w:val="left"/>
+            </w:pPr>
+            <w:r>
+              <w:rPr>
+                <w:rFonts w:ascii="Times New Roman" w:hAnsi="Times New Roman" w:cs="Times New Roman" w:eastAsia="Times New Roman"/>
+                <w:b w:val="0"/>
+                <w:i w:val="0"/>
+                <w:color w:val="000000"/>
+                <w:sz w:val="24"/>
+              </w:rPr>
+              <w:t>Часто задаваемые вопросы</w:t>
+            </w:r>
+          </w:p>
+        </w:tc>
+      </w:tr>
+      <w:tr>
+        <w:trPr>
+          <w:cantSplit/>
+        </w:trPr>
+        <w:tc>
+          <w:tcPr>
+            <w:tcW w:type="dxa" w:w="3118"/>
+            <w:vAlign w:val="center"/>
+          </w:tcPr>
+          <w:p>
+            <w:pPr>
+              <w:spacing w:line="360" w:lineRule="auto" w:before="20" w:after="20"/>
+              <w:jc w:val="left"/>
+            </w:pPr>
+            <w:r>
+              <w:rPr>
+                <w:rFonts w:ascii="Courier New" w:hAnsi="Courier New" w:cs="Courier New" w:eastAsia="Courier New"/>
+                <w:color w:val="000000"/>
+                <w:sz w:val="22"/>
+              </w:rPr>
+              <w:t>aftercare.html</w:t>
+            </w:r>
+          </w:p>
+        </w:tc>
+        <w:tc>
+          <w:tcPr>
+            <w:tcW w:type="dxa" w:w="5669"/>
+            <w:vAlign w:val="center"/>
+          </w:tcPr>
+          <w:p>
+            <w:pPr>
+              <w:spacing w:line="360" w:lineRule="auto" w:before="20" w:after="20"/>
+              <w:jc w:val="left"/>
+            </w:pPr>
+            <w:r>
+              <w:rPr>
+                <w:rFonts w:ascii="Times New Roman" w:hAnsi="Times New Roman" w:cs="Times New Roman" w:eastAsia="Times New Roman"/>
+                <w:b w:val="0"/>
+                <w:i w:val="0"/>
+                <w:color w:val="000000"/>
+                <w:sz w:val="24"/>
+              </w:rPr>
+              <w:t>Правила ухода после татуировки</w:t>
+            </w:r>
+          </w:p>
+        </w:tc>
+      </w:tr>
+      <w:tr>
+        <w:trPr>
+          <w:cantSplit/>
+        </w:trPr>
+        <w:tc>
+          <w:tcPr>
+            <w:tcW w:type="dxa" w:w="3118"/>
+            <w:vAlign w:val="center"/>
+          </w:tcPr>
+          <w:p>
+            <w:pPr>
+              <w:spacing w:line="360" w:lineRule="auto" w:before="20" w:after="20"/>
+              <w:jc w:val="left"/>
+            </w:pPr>
+            <w:r>
+              <w:rPr>
+                <w:rFonts w:ascii="Courier New" w:hAnsi="Courier New" w:cs="Courier New" w:eastAsia="Courier New"/>
+                <w:color w:val="000000"/>
+                <w:sz w:val="22"/>
+              </w:rPr>
+              <w:t>contacts.html</w:t>
+            </w:r>
+          </w:p>
+        </w:tc>
+        <w:tc>
+          <w:tcPr>
+            <w:tcW w:type="dxa" w:w="5669"/>
+            <w:vAlign w:val="center"/>
+          </w:tcPr>
+          <w:p>
+            <w:pPr>
+              <w:spacing w:line="360" w:lineRule="auto" w:before="20" w:after="20"/>
+              <w:jc w:val="left"/>
+            </w:pPr>
+            <w:r>
+              <w:rPr>
+                <w:rFonts w:ascii="Times New Roman" w:hAnsi="Times New Roman" w:cs="Times New Roman" w:eastAsia="Times New Roman"/>
+                <w:b w:val="0"/>
+                <w:i w:val="0"/>
+                <w:color w:val="000000"/>
+                <w:sz w:val="24"/>
+              </w:rPr>
+              <w:t>Контактная информация и схема проезда</w:t>
+            </w:r>
+          </w:p>
+        </w:tc>
+      </w:tr>
+      <w:tr>
+        <w:trPr>
+          <w:cantSplit/>
+        </w:trPr>
+        <w:tc>
+          <w:tcPr>
+            <w:tcW w:type="dxa" w:w="3118"/>
+            <w:vAlign w:val="center"/>
+          </w:tcPr>
+          <w:p>
+            <w:pPr>
+              <w:spacing w:line="360" w:lineRule="auto" w:before="20" w:after="20"/>
+              <w:jc w:val="left"/>
+            </w:pPr>
+            <w:r>
+              <w:rPr>
+                <w:rFonts w:ascii="Courier New" w:hAnsi="Courier New" w:cs="Courier New" w:eastAsia="Courier New"/>
+                <w:color w:val="000000"/>
+                <w:sz w:val="22"/>
+              </w:rPr>
+              <w:t>style.css</w:t>
+            </w:r>
+          </w:p>
+        </w:tc>
+        <w:tc>
+          <w:tcPr>
+            <w:tcW w:type="dxa" w:w="5669"/>
+            <w:vAlign w:val="center"/>
+          </w:tcPr>
+          <w:p>
+            <w:pPr>
+              <w:spacing w:line="360" w:lineRule="auto" w:before="20" w:after="20"/>
+              <w:jc w:val="left"/>
+            </w:pPr>
+            <w:r>
+              <w:rPr>
+                <w:rFonts w:ascii="Times New Roman" w:hAnsi="Times New Roman" w:cs="Times New Roman" w:eastAsia="Times New Roman"/>
+                <w:b w:val="0"/>
+                <w:i w:val="0"/>
+                <w:color w:val="000000"/>
+                <w:sz w:val="24"/>
+              </w:rPr>
+              <w:t>Глобальные стили — дизайн-система, типографика, сетка</w:t>
+            </w:r>
+          </w:p>
+        </w:tc>
+      </w:tr>
+      <w:tr>
+        <w:trPr>
+          <w:cantSplit/>
+        </w:trPr>
+        <w:tc>
+          <w:tcPr>
+            <w:tcW w:type="dxa" w:w="3118"/>
+            <w:vAlign w:val="center"/>
+          </w:tcPr>
+          <w:p>
+            <w:pPr>
+              <w:spacing w:line="360" w:lineRule="auto" w:before="20" w:after="20"/>
+              <w:jc w:val="left"/>
+            </w:pPr>
+            <w:r>
+              <w:rPr>
+                <w:rFonts w:ascii="Courier New" w:hAnsi="Courier New" w:cs="Courier New" w:eastAsia="Courier New"/>
+                <w:color w:val="000000"/>
+                <w:sz w:val="22"/>
+              </w:rPr>
+              <w:t>css/cabinet.css</w:t>
+            </w:r>
+          </w:p>
+        </w:tc>
+        <w:tc>
+          <w:tcPr>
+            <w:tcW w:type="dxa" w:w="5669"/>
+            <w:vAlign w:val="center"/>
+          </w:tcPr>
+          <w:p>
+            <w:pPr>
+              <w:spacing w:line="360" w:lineRule="auto" w:before="20" w:after="20"/>
+              <w:jc w:val="left"/>
+            </w:pPr>
+            <w:r>
+              <w:rPr>
+                <w:rFonts w:ascii="Times New Roman" w:hAnsi="Times New Roman" w:cs="Times New Roman" w:eastAsia="Times New Roman"/>
+                <w:b w:val="0"/>
+                <w:i w:val="0"/>
+                <w:color w:val="000000"/>
+                <w:sz w:val="24"/>
+              </w:rPr>
+              <w:t>Стили личного кабинета</w:t>
+            </w:r>
+          </w:p>
+        </w:tc>
+      </w:tr>
+      <w:tr>
+        <w:trPr>
+          <w:cantSplit/>
+        </w:trPr>
+        <w:tc>
+          <w:tcPr>
+            <w:tcW w:type="dxa" w:w="3118"/>
+            <w:vAlign w:val="center"/>
+          </w:tcPr>
+          <w:p>
+            <w:pPr>
+              <w:spacing w:line="360" w:lineRule="auto" w:before="20" w:after="20"/>
+              <w:jc w:val="left"/>
+            </w:pPr>
+            <w:r>
+              <w:rPr>
+                <w:rFonts w:ascii="Courier New" w:hAnsi="Courier New" w:cs="Courier New" w:eastAsia="Courier New"/>
+                <w:color w:val="000000"/>
+                <w:sz w:val="22"/>
+              </w:rPr>
+              <w:t>css/admin.css</w:t>
+            </w:r>
+          </w:p>
+        </w:tc>
+        <w:tc>
+          <w:tcPr>
+            <w:tcW w:type="dxa" w:w="5669"/>
+            <w:vAlign w:val="center"/>
+          </w:tcPr>
+          <w:p>
+            <w:pPr>
+              <w:spacing w:line="360" w:lineRule="auto" w:before="20" w:after="20"/>
+              <w:jc w:val="left"/>
+            </w:pPr>
+            <w:r>
+              <w:rPr>
+                <w:rFonts w:ascii="Times New Roman" w:hAnsi="Times New Roman" w:cs="Times New Roman" w:eastAsia="Times New Roman"/>
+                <w:b w:val="0"/>
+                <w:i w:val="0"/>
+                <w:color w:val="000000"/>
+                <w:sz w:val="24"/>
+              </w:rPr>
+              <w:t>Стили панели администратора</w:t>
+            </w:r>
+          </w:p>
+        </w:tc>
+      </w:tr>
+      <w:tr>
+        <w:trPr>
+          <w:cantSplit/>
+        </w:trPr>
+        <w:tc>
+          <w:tcPr>
+            <w:tcW w:type="dxa" w:w="3118"/>
+            <w:vAlign w:val="center"/>
+          </w:tcPr>
+          <w:p>
+            <w:pPr>
+              <w:spacing w:line="360" w:lineRule="auto" w:before="20" w:after="20"/>
+              <w:jc w:val="left"/>
+            </w:pPr>
+            <w:r>
+              <w:rPr>
+                <w:rFonts w:ascii="Courier New" w:hAnsi="Courier New" w:cs="Courier New" w:eastAsia="Courier New"/>
+                <w:color w:val="000000"/>
+                <w:sz w:val="22"/>
+              </w:rPr>
+              <w:t>css/orbital-nav.css</w:t>
+            </w:r>
+          </w:p>
+        </w:tc>
+        <w:tc>
+          <w:tcPr>
+            <w:tcW w:type="dxa" w:w="5669"/>
+            <w:vAlign w:val="center"/>
+          </w:tcPr>
+          <w:p>
+            <w:pPr>
+              <w:spacing w:line="360" w:lineRule="auto" w:before="20" w:after="20"/>
+              <w:jc w:val="left"/>
+            </w:pPr>
+            <w:r>
+              <w:rPr>
+                <w:rFonts w:ascii="Times New Roman" w:hAnsi="Times New Roman" w:cs="Times New Roman" w:eastAsia="Times New Roman"/>
+                <w:b w:val="0"/>
+                <w:i w:val="0"/>
+                <w:color w:val="000000"/>
+                <w:sz w:val="24"/>
+              </w:rPr>
+              <w:t>Стили орбитальной навигации</w:t>
+            </w:r>
+          </w:p>
+        </w:tc>
+      </w:tr>
+      <w:tr>
+        <w:trPr>
+          <w:cantSplit/>
+        </w:trPr>
+        <w:tc>
+          <w:tcPr>
+            <w:tcW w:type="dxa" w:w="3118"/>
+            <w:vAlign w:val="center"/>
+          </w:tcPr>
+          <w:p>
+            <w:pPr>
+              <w:spacing w:line="360" w:lineRule="auto" w:before="20" w:after="20"/>
+              <w:jc w:val="left"/>
+            </w:pPr>
+            <w:r>
+              <w:rPr>
+                <w:rFonts w:ascii="Courier New" w:hAnsi="Courier New" w:cs="Courier New" w:eastAsia="Courier New"/>
+                <w:color w:val="000000"/>
+                <w:sz w:val="22"/>
+              </w:rPr>
+              <w:t>js/common.js</w:t>
+            </w:r>
+          </w:p>
+        </w:tc>
+        <w:tc>
+          <w:tcPr>
+            <w:tcW w:type="dxa" w:w="5669"/>
+            <w:vAlign w:val="center"/>
+          </w:tcPr>
+          <w:p>
+            <w:pPr>
+              <w:spacing w:line="360" w:lineRule="auto" w:before="20" w:after="20"/>
+              <w:jc w:val="left"/>
+            </w:pPr>
+            <w:r>
+              <w:rPr>
+                <w:rFonts w:ascii="Times New Roman" w:hAnsi="Times New Roman" w:cs="Times New Roman" w:eastAsia="Times New Roman"/>
+                <w:b w:val="0"/>
+                <w:i w:val="0"/>
+                <w:color w:val="000000"/>
+                <w:sz w:val="24"/>
+              </w:rPr>
+              <w:t>Общие утилиты — навигация, бургер-меню, FAQ-аккордеон</w:t>
+            </w:r>
+          </w:p>
+        </w:tc>
+      </w:tr>
+      <w:tr>
+        <w:trPr>
+          <w:cantSplit/>
+        </w:trPr>
+        <w:tc>
+          <w:tcPr>
+            <w:tcW w:type="dxa" w:w="3118"/>
+            <w:vAlign w:val="center"/>
+          </w:tcPr>
+          <w:p>
+            <w:pPr>
+              <w:spacing w:line="360" w:lineRule="auto" w:before="20" w:after="20"/>
+              <w:jc w:val="left"/>
+            </w:pPr>
+            <w:r>
+              <w:rPr>
+                <w:rFonts w:ascii="Courier New" w:hAnsi="Courier New" w:cs="Courier New" w:eastAsia="Courier New"/>
+                <w:color w:val="000000"/>
+                <w:sz w:val="22"/>
+              </w:rPr>
+              <w:t>js/hero-3d.js</w:t>
+            </w:r>
+          </w:p>
+        </w:tc>
+        <w:tc>
+          <w:tcPr>
+            <w:tcW w:type="dxa" w:w="5669"/>
+            <w:vAlign w:val="center"/>
+          </w:tcPr>
+          <w:p>
+            <w:pPr>
+              <w:spacing w:line="360" w:lineRule="auto" w:before="20" w:after="20"/>
+              <w:jc w:val="left"/>
+            </w:pPr>
+            <w:r>
+              <w:rPr>
+                <w:rFonts w:ascii="Times New Roman" w:hAnsi="Times New Roman" w:cs="Times New Roman" w:eastAsia="Times New Roman"/>
+                <w:b w:val="0"/>
+                <w:i w:val="0"/>
+                <w:color w:val="000000"/>
+                <w:sz w:val="24"/>
+              </w:rPr>
+              <w:t>Three.js — загрузка 3D-модели и скролл-анимация</w:t>
+            </w:r>
+          </w:p>
+        </w:tc>
+      </w:tr>
+      <w:tr>
+        <w:trPr>
+          <w:cantSplit/>
+        </w:trPr>
+        <w:tc>
+          <w:tcPr>
+            <w:tcW w:type="dxa" w:w="3118"/>
+            <w:vAlign w:val="center"/>
+          </w:tcPr>
+          <w:p>
+            <w:pPr>
+              <w:spacing w:line="360" w:lineRule="auto" w:before="20" w:after="20"/>
+              <w:jc w:val="left"/>
+            </w:pPr>
+            <w:r>
+              <w:rPr>
+                <w:rFonts w:ascii="Courier New" w:hAnsi="Courier New" w:cs="Courier New" w:eastAsia="Courier New"/>
+                <w:color w:val="000000"/>
+                <w:sz w:val="22"/>
+              </w:rPr>
+              <w:t>js/home.js</w:t>
+            </w:r>
+          </w:p>
+        </w:tc>
+        <w:tc>
+          <w:tcPr>
+            <w:tcW w:type="dxa" w:w="5669"/>
+            <w:vAlign w:val="center"/>
+          </w:tcPr>
+          <w:p>
+            <w:pPr>
+              <w:spacing w:line="360" w:lineRule="auto" w:before="20" w:after="20"/>
+              <w:jc w:val="left"/>
+            </w:pPr>
+            <w:r>
+              <w:rPr>
+                <w:rFonts w:ascii="Times New Roman" w:hAnsi="Times New Roman" w:cs="Times New Roman" w:eastAsia="Times New Roman"/>
+                <w:b w:val="0"/>
+                <w:i w:val="0"/>
+                <w:color w:val="000000"/>
+                <w:sz w:val="24"/>
+              </w:rPr>
+              <w:t>Логика главной страницы — часы, smoke-particles (GSAP)</w:t>
+            </w:r>
+          </w:p>
+        </w:tc>
+      </w:tr>
+      <w:tr>
+        <w:trPr>
+          <w:cantSplit/>
+        </w:trPr>
+        <w:tc>
+          <w:tcPr>
+            <w:tcW w:type="dxa" w:w="3118"/>
+            <w:vAlign w:val="center"/>
+          </w:tcPr>
+          <w:p>
+            <w:pPr>
+              <w:spacing w:line="360" w:lineRule="auto" w:before="20" w:after="20"/>
+              <w:jc w:val="left"/>
+            </w:pPr>
+            <w:r>
+              <w:rPr>
+                <w:rFonts w:ascii="Courier New" w:hAnsi="Courier New" w:cs="Courier New" w:eastAsia="Courier New"/>
+                <w:color w:val="000000"/>
+                <w:sz w:val="22"/>
+              </w:rPr>
+              <w:t>js/booking.js</w:t>
+            </w:r>
+          </w:p>
+        </w:tc>
+        <w:tc>
+          <w:tcPr>
+            <w:tcW w:type="dxa" w:w="5669"/>
+            <w:vAlign w:val="center"/>
+          </w:tcPr>
+          <w:p>
+            <w:pPr>
+              <w:spacing w:line="360" w:lineRule="auto" w:before="20" w:after="20"/>
+              <w:jc w:val="left"/>
+            </w:pPr>
+            <w:r>
+              <w:rPr>
+                <w:rFonts w:ascii="Times New Roman" w:hAnsi="Times New Roman" w:cs="Times New Roman" w:eastAsia="Times New Roman"/>
+                <w:b w:val="0"/>
+                <w:i w:val="0"/>
+                <w:color w:val="000000"/>
+                <w:sz w:val="24"/>
+              </w:rPr>
+              <w:t>Календарь, получение слотов, форма онлайн-записи</w:t>
+            </w:r>
+          </w:p>
+        </w:tc>
+      </w:tr>
+      <w:tr>
+        <w:trPr>
+          <w:cantSplit/>
+        </w:trPr>
+        <w:tc>
+          <w:tcPr>
+            <w:tcW w:type="dxa" w:w="3118"/>
+            <w:vAlign w:val="center"/>
+          </w:tcPr>
+          <w:p>
+            <w:pPr>
+              <w:spacing w:line="360" w:lineRule="auto" w:before="20" w:after="20"/>
+              <w:jc w:val="left"/>
+            </w:pPr>
+            <w:r>
+              <w:rPr>
+                <w:rFonts w:ascii="Courier New" w:hAnsi="Courier New" w:cs="Courier New" w:eastAsia="Courier New"/>
+                <w:color w:val="000000"/>
+                <w:sz w:val="22"/>
+              </w:rPr>
+              <w:t>js/cabinet.js</w:t>
+            </w:r>
+          </w:p>
+        </w:tc>
+        <w:tc>
+          <w:tcPr>
+            <w:tcW w:type="dxa" w:w="5669"/>
+            <w:vAlign w:val="center"/>
+          </w:tcPr>
+          <w:p>
+            <w:pPr>
+              <w:spacing w:line="360" w:lineRule="auto" w:before="20" w:after="20"/>
+              <w:jc w:val="left"/>
+            </w:pPr>
+            <w:r>
+              <w:rPr>
+                <w:rFonts w:ascii="Times New Roman" w:hAnsi="Times New Roman" w:cs="Times New Roman" w:eastAsia="Times New Roman"/>
+                <w:b w:val="0"/>
+                <w:i w:val="0"/>
+                <w:color w:val="000000"/>
+                <w:sz w:val="24"/>
+              </w:rPr>
+              <w:t>Авторизация клиента, профиль, история, инбокс</w:t>
+            </w:r>
+          </w:p>
+        </w:tc>
+      </w:tr>
+      <w:tr>
+        <w:trPr>
+          <w:cantSplit/>
+        </w:trPr>
+        <w:tc>
+          <w:tcPr>
+            <w:tcW w:type="dxa" w:w="3118"/>
+            <w:vAlign w:val="center"/>
+          </w:tcPr>
+          <w:p>
+            <w:pPr>
+              <w:spacing w:line="360" w:lineRule="auto" w:before="20" w:after="20"/>
+              <w:jc w:val="left"/>
+            </w:pPr>
+            <w:r>
+              <w:rPr>
+                <w:rFonts w:ascii="Courier New" w:hAnsi="Courier New" w:cs="Courier New" w:eastAsia="Courier New"/>
+                <w:color w:val="000000"/>
+                <w:sz w:val="22"/>
+              </w:rPr>
+              <w:t>js/lightbox.js</w:t>
+            </w:r>
+          </w:p>
+        </w:tc>
+        <w:tc>
+          <w:tcPr>
+            <w:tcW w:type="dxa" w:w="5669"/>
+            <w:vAlign w:val="center"/>
+          </w:tcPr>
+          <w:p>
+            <w:pPr>
+              <w:spacing w:line="360" w:lineRule="auto" w:before="20" w:after="20"/>
+              <w:jc w:val="left"/>
+            </w:pPr>
+            <w:r>
+              <w:rPr>
+                <w:rFonts w:ascii="Times New Roman" w:hAnsi="Times New Roman" w:cs="Times New Roman" w:eastAsia="Times New Roman"/>
+                <w:b w:val="0"/>
+                <w:i w:val="0"/>
+                <w:color w:val="000000"/>
+                <w:sz w:val="24"/>
+              </w:rPr>
+              <w:t>Полноэкранный просмотр изображений портфолио</w:t>
+            </w:r>
+          </w:p>
+        </w:tc>
+      </w:tr>
+      <w:tr>
+        <w:trPr>
+          <w:cantSplit/>
+        </w:trPr>
+        <w:tc>
+          <w:tcPr>
+            <w:tcW w:type="dxa" w:w="3118"/>
+            <w:vAlign w:val="center"/>
+          </w:tcPr>
+          <w:p>
+            <w:pPr>
+              <w:spacing w:line="360" w:lineRule="auto" w:before="20" w:after="20"/>
+              <w:jc w:val="left"/>
+            </w:pPr>
+            <w:r>
+              <w:rPr>
+                <w:rFonts w:ascii="Courier New" w:hAnsi="Courier New" w:cs="Courier New" w:eastAsia="Courier New"/>
+                <w:color w:val="000000"/>
+                <w:sz w:val="22"/>
+              </w:rPr>
+              <w:t>js/orbital-nav.js</w:t>
+            </w:r>
+          </w:p>
+        </w:tc>
+        <w:tc>
+          <w:tcPr>
+            <w:tcW w:type="dxa" w:w="5669"/>
+            <w:vAlign w:val="center"/>
+          </w:tcPr>
+          <w:p>
+            <w:pPr>
+              <w:spacing w:line="360" w:lineRule="auto" w:before="20" w:after="20"/>
+              <w:jc w:val="left"/>
+            </w:pPr>
+            <w:r>
+              <w:rPr>
+                <w:rFonts w:ascii="Times New Roman" w:hAnsi="Times New Roman" w:cs="Times New Roman" w:eastAsia="Times New Roman"/>
+                <w:b w:val="0"/>
+                <w:i w:val="0"/>
+                <w:color w:val="000000"/>
+                <w:sz w:val="24"/>
+              </w:rPr>
+              <w:t>Орбитальная навигация по разделам главной страницы</w:t>
+            </w:r>
+          </w:p>
+        </w:tc>
+      </w:tr>
+      <w:tr>
+        <w:trPr>
+          <w:cantSplit/>
+        </w:trPr>
+        <w:tc>
+          <w:tcPr>
+            <w:tcW w:type="dxa" w:w="3118"/>
+            <w:vAlign w:val="center"/>
+          </w:tcPr>
+          <w:p>
+            <w:pPr>
+              <w:spacing w:line="360" w:lineRule="auto" w:before="20" w:after="20"/>
+              <w:jc w:val="left"/>
+            </w:pPr>
+            <w:r>
+              <w:rPr>
+                <w:rFonts w:ascii="Courier New" w:hAnsi="Courier New" w:cs="Courier New" w:eastAsia="Courier New"/>
+                <w:color w:val="000000"/>
+                <w:sz w:val="22"/>
+              </w:rPr>
+              <w:t>js/glass-filter.js</w:t>
+            </w:r>
+          </w:p>
+        </w:tc>
+        <w:tc>
+          <w:tcPr>
+            <w:tcW w:type="dxa" w:w="5669"/>
+            <w:vAlign w:val="center"/>
+          </w:tcPr>
+          <w:p>
+            <w:pPr>
+              <w:spacing w:line="360" w:lineRule="auto" w:before="20" w:after="20"/>
+              <w:jc w:val="left"/>
+            </w:pPr>
+            <w:r>
+              <w:rPr>
+                <w:rFonts w:ascii="Times New Roman" w:hAnsi="Times New Roman" w:cs="Times New Roman" w:eastAsia="Times New Roman"/>
+                <w:b w:val="0"/>
+                <w:i w:val="0"/>
+                <w:color w:val="000000"/>
+                <w:sz w:val="24"/>
+              </w:rPr>
+              <w:t>Эффект «жидкого стекла» в hero-секции</w:t>
+            </w:r>
+          </w:p>
+        </w:tc>
+      </w:tr>
+      <w:tr>
+        <w:trPr>
+          <w:cantSplit/>
+        </w:trPr>
+        <w:tc>
+          <w:tcPr>
+            <w:tcW w:type="dxa" w:w="3118"/>
+            <w:vAlign w:val="center"/>
+          </w:tcPr>
+          <w:p>
+            <w:pPr>
+              <w:spacing w:line="360" w:lineRule="auto" w:before="20" w:after="20"/>
+              <w:jc w:val="left"/>
+            </w:pPr>
+            <w:r>
+              <w:rPr>
+                <w:rFonts w:ascii="Courier New" w:hAnsi="Courier New" w:cs="Courier New" w:eastAsia="Courier New"/>
+                <w:color w:val="000000"/>
+                <w:sz w:val="22"/>
+              </w:rPr>
+              <w:t>js/push-client.js</w:t>
+            </w:r>
+          </w:p>
+        </w:tc>
+        <w:tc>
+          <w:tcPr>
+            <w:tcW w:type="dxa" w:w="5669"/>
+            <w:vAlign w:val="center"/>
+          </w:tcPr>
+          <w:p>
+            <w:pPr>
+              <w:spacing w:line="360" w:lineRule="auto" w:before="20" w:after="20"/>
+              <w:jc w:val="left"/>
+            </w:pPr>
+            <w:r>
+              <w:rPr>
+                <w:rFonts w:ascii="Times New Roman" w:hAnsi="Times New Roman" w:cs="Times New Roman" w:eastAsia="Times New Roman"/>
+                <w:b w:val="0"/>
+                <w:i w:val="0"/>
+                <w:color w:val="000000"/>
+                <w:sz w:val="24"/>
+              </w:rPr>
+              <w:t>Подписка на Web Push уведомления в браузере</w:t>
+            </w:r>
+          </w:p>
+        </w:tc>
+      </w:tr>
+      <w:tr>
+        <w:trPr>
+          <w:cantSplit/>
+        </w:trPr>
+        <w:tc>
+          <w:tcPr>
+            <w:tcW w:type="dxa" w:w="3118"/>
+            <w:vAlign w:val="center"/>
+          </w:tcPr>
+          <w:p>
+            <w:pPr>
+              <w:spacing w:line="360" w:lineRule="auto" w:before="20" w:after="20"/>
+              <w:jc w:val="left"/>
+            </w:pPr>
+            <w:r>
+              <w:rPr>
+                <w:rFonts w:ascii="Courier New" w:hAnsi="Courier New" w:cs="Courier New" w:eastAsia="Courier New"/>
+                <w:color w:val="000000"/>
+                <w:sz w:val="22"/>
+              </w:rPr>
+              <w:t>sw.js</w:t>
+            </w:r>
+          </w:p>
+        </w:tc>
+        <w:tc>
+          <w:tcPr>
+            <w:tcW w:type="dxa" w:w="5669"/>
+            <w:vAlign w:val="center"/>
+          </w:tcPr>
+          <w:p>
+            <w:pPr>
+              <w:spacing w:line="360" w:lineRule="auto" w:before="20" w:after="20"/>
+              <w:jc w:val="left"/>
+            </w:pPr>
+            <w:r>
+              <w:rPr>
+                <w:rFonts w:ascii="Times New Roman" w:hAnsi="Times New Roman" w:cs="Times New Roman" w:eastAsia="Times New Roman"/>
+                <w:b w:val="0"/>
+                <w:i w:val="0"/>
+                <w:color w:val="000000"/>
+                <w:sz w:val="24"/>
+              </w:rPr>
+              <w:t>Service Worker — Web Push и PWA-функциональность</w:t>
+            </w:r>
+          </w:p>
+        </w:tc>
+      </w:tr>
+    </w:tbl>
+    <w:p>
+      <w:pPr>
+        <w:spacing w:line="360" w:lineRule="auto" w:before="120" w:after="80"/>
+        <w:ind w:firstLine="709"/>
+        <w:jc w:val="both"/>
+      </w:pPr>
+      <w:r>
+        <w:rPr>
+          <w:rFonts w:ascii="Times New Roman" w:hAnsi="Times New Roman" w:cs="Times New Roman" w:eastAsia="Times New Roman"/>
+          <w:b w:val="0"/>
+          <w:i w:val="0"/>
+          <w:color w:val="000000"/>
+          <w:sz w:val="28"/>
+        </w:rPr>
+        <w:t>Серверные модули приведены в таблице А.2.</w:t>
+      </w:r>
+    </w:p>
+    <w:p>
+      <w:pPr>
+        <w:spacing w:line="360" w:lineRule="auto" w:before="120" w:after="60"/>
+        <w:ind w:firstLine="0"/>
+        <w:jc w:val="left"/>
+      </w:pPr>
+      <w:r>
+        <w:rPr>
+          <w:rFonts w:ascii="Times New Roman" w:hAnsi="Times New Roman" w:cs="Times New Roman" w:eastAsia="Times New Roman"/>
+          <w:b w:val="0"/>
+          <w:i w:val="0"/>
+          <w:color w:val="000000"/>
+          <w:sz w:val="28"/>
+        </w:rPr>
+        <w:t>Таблица А.2 — Перечень серверных модулей</w:t>
+      </w:r>
+    </w:p>
+    <w:tbl>
+      <w:tblPr>
+        <w:tblStyle w:val="TableGrid"/>
+        <w:tblW w:type="auto" w:w="0"/>
+        <w:jc w:val="center"/>
+        <w:tblLook w:firstColumn="1" w:firstRow="1" w:lastColumn="0" w:lastRow="0" w:noHBand="0" w:noVBand="1" w:val="04A0"/>
+      </w:tblPr>
+      <w:tblGrid>
+        <w:gridCol w:w="4561"/>
+        <w:gridCol w:w="4561"/>
+      </w:tblGrid>
+      <w:tr>
+        <w:trPr>
+          <w:cantSplit/>
+        </w:trPr>
+        <w:tc>
+          <w:tcPr>
+            <w:tcW w:type="dxa" w:w="3118"/>
+            <w:vAlign w:val="center"/>
+            <w:shd w:val="clear" w:color="auto" w:fill="D9D9D9"/>
+          </w:tcPr>
+          <w:p>
+            <w:pPr>
+              <w:spacing w:line="360" w:lineRule="auto" w:before="40" w:after="40"/>
+              <w:jc w:val="center"/>
+            </w:pPr>
+            <w:r>
+              <w:rPr>
+                <w:rFonts w:ascii="Times New Roman" w:hAnsi="Times New Roman" w:cs="Times New Roman" w:eastAsia="Times New Roman"/>
+                <w:b/>
+                <w:i w:val="0"/>
+                <w:color w:val="000000"/>
+                <w:sz w:val="24"/>
+              </w:rPr>
+              <w:t>Наименование</w:t>
+            </w:r>
+          </w:p>
+        </w:tc>
+        <w:tc>
+          <w:tcPr>
+            <w:tcW w:type="dxa" w:w="5669"/>
+            <w:vAlign w:val="center"/>
+            <w:shd w:val="clear" w:color="auto" w:fill="D9D9D9"/>
+          </w:tcPr>
+          <w:p>
+            <w:pPr>
+              <w:spacing w:line="360" w:lineRule="auto" w:before="40" w:after="40"/>
+              <w:jc w:val="center"/>
+            </w:pPr>
+            <w:r>
+              <w:rPr>
+                <w:rFonts w:ascii="Times New Roman" w:hAnsi="Times New Roman" w:cs="Times New Roman" w:eastAsia="Times New Roman"/>
+                <w:b/>
+                <w:i w:val="0"/>
+                <w:color w:val="000000"/>
+                <w:sz w:val="24"/>
+              </w:rPr>
+              <w:t>Описание</w:t>
+            </w:r>
+          </w:p>
+        </w:tc>
+      </w:tr>
+      <w:tr>
+        <w:trPr>
+          <w:cantSplit/>
+        </w:trPr>
+        <w:tc>
+          <w:tcPr>
+            <w:tcW w:type="dxa" w:w="3118"/>
+            <w:vAlign w:val="center"/>
+          </w:tcPr>
+          <w:p>
+            <w:pPr>
+              <w:spacing w:line="360" w:lineRule="auto" w:before="20" w:after="20"/>
+              <w:jc w:val="left"/>
+            </w:pPr>
+            <w:r>
+              <w:rPr>
+                <w:rFonts w:ascii="Courier New" w:hAnsi="Courier New" w:cs="Courier New" w:eastAsia="Courier New"/>
+                <w:color w:val="000000"/>
+                <w:sz w:val="22"/>
+              </w:rPr>
+              <w:t>server/index.js</w:t>
+            </w:r>
+          </w:p>
+        </w:tc>
+        <w:tc>
+          <w:tcPr>
+            <w:tcW w:type="dxa" w:w="5669"/>
+            <w:vAlign w:val="center"/>
+          </w:tcPr>
+          <w:p>
+            <w:pPr>
+              <w:spacing w:line="360" w:lineRule="auto" w:before="20" w:after="20"/>
+              <w:jc w:val="left"/>
+            </w:pPr>
+            <w:r>
+              <w:rPr>
+                <w:rFonts w:ascii="Times New Roman" w:hAnsi="Times New Roman" w:cs="Times New Roman" w:eastAsia="Times New Roman"/>
+                <w:b w:val="0"/>
+                <w:i w:val="0"/>
+                <w:color w:val="000000"/>
+                <w:sz w:val="24"/>
+              </w:rPr>
+              <w:t>Точка входа Express-сервера — инициализация, middleware, маршруты</w:t>
+            </w:r>
+          </w:p>
+        </w:tc>
+      </w:tr>
+      <w:tr>
+        <w:trPr>
+          <w:cantSplit/>
+        </w:trPr>
+        <w:tc>
+          <w:tcPr>
+            <w:tcW w:type="dxa" w:w="3118"/>
+            <w:vAlign w:val="center"/>
+          </w:tcPr>
+          <w:p>
+            <w:pPr>
+              <w:spacing w:line="360" w:lineRule="auto" w:before="20" w:after="20"/>
+              <w:jc w:val="left"/>
+            </w:pPr>
+            <w:r>
+              <w:rPr>
+                <w:rFonts w:ascii="Courier New" w:hAnsi="Courier New" w:cs="Courier New" w:eastAsia="Courier New"/>
+                <w:color w:val="000000"/>
+                <w:sz w:val="22"/>
+              </w:rPr>
+              <w:t>server/db.js</w:t>
+            </w:r>
+          </w:p>
+        </w:tc>
+        <w:tc>
+          <w:tcPr>
+            <w:tcW w:type="dxa" w:w="5669"/>
+            <w:vAlign w:val="center"/>
+          </w:tcPr>
+          <w:p>
+            <w:pPr>
+              <w:spacing w:line="360" w:lineRule="auto" w:before="20" w:after="20"/>
+              <w:jc w:val="left"/>
+            </w:pPr>
+            <w:r>
+              <w:rPr>
+                <w:rFonts w:ascii="Times New Roman" w:hAnsi="Times New Roman" w:cs="Times New Roman" w:eastAsia="Times New Roman"/>
+                <w:b w:val="0"/>
+                <w:i w:val="0"/>
+                <w:color w:val="000000"/>
+                <w:sz w:val="24"/>
+              </w:rPr>
+              <w:t>Уровень доступа к MySQL — пул соединений, обёртки query/get/run/transaction</w:t>
+            </w:r>
+          </w:p>
+        </w:tc>
+      </w:tr>
+      <w:tr>
+        <w:trPr>
+          <w:cantSplit/>
+        </w:trPr>
+        <w:tc>
+          <w:tcPr>
+            <w:tcW w:type="dxa" w:w="3118"/>
+            <w:vAlign w:val="center"/>
+          </w:tcPr>
+          <w:p>
+            <w:pPr>
+              <w:spacing w:line="360" w:lineRule="auto" w:before="20" w:after="20"/>
+              <w:jc w:val="left"/>
+            </w:pPr>
+            <w:r>
+              <w:rPr>
+                <w:rFonts w:ascii="Courier New" w:hAnsi="Courier New" w:cs="Courier New" w:eastAsia="Courier New"/>
+                <w:color w:val="000000"/>
+                <w:sz w:val="22"/>
+              </w:rPr>
+              <w:t>server/routes/auth.js</w:t>
+            </w:r>
+          </w:p>
+        </w:tc>
+        <w:tc>
+          <w:tcPr>
+            <w:tcW w:type="dxa" w:w="5669"/>
+            <w:vAlign w:val="center"/>
+          </w:tcPr>
+          <w:p>
+            <w:pPr>
+              <w:spacing w:line="360" w:lineRule="auto" w:before="20" w:after="20"/>
+              <w:jc w:val="left"/>
+            </w:pPr>
+            <w:r>
+              <w:rPr>
+                <w:rFonts w:ascii="Times New Roman" w:hAnsi="Times New Roman" w:cs="Times New Roman" w:eastAsia="Times New Roman"/>
+                <w:b w:val="0"/>
+                <w:i w:val="0"/>
+                <w:color w:val="000000"/>
+                <w:sz w:val="24"/>
+              </w:rPr>
+              <w:t>Аутентификация администратора — вход и смена пароля (JWT)</w:t>
+            </w:r>
+          </w:p>
+        </w:tc>
+      </w:tr>
+      <w:tr>
+        <w:trPr>
+          <w:cantSplit/>
+        </w:trPr>
+        <w:tc>
+          <w:tcPr>
+            <w:tcW w:type="dxa" w:w="3118"/>
+            <w:vAlign w:val="center"/>
+          </w:tcPr>
+          <w:p>
+            <w:pPr>
+              <w:spacing w:line="360" w:lineRule="auto" w:before="20" w:after="20"/>
+              <w:jc w:val="left"/>
+            </w:pPr>
+            <w:r>
+              <w:rPr>
+                <w:rFonts w:ascii="Courier New" w:hAnsi="Courier New" w:cs="Courier New" w:eastAsia="Courier New"/>
+                <w:color w:val="000000"/>
+                <w:sz w:val="22"/>
+              </w:rPr>
+              <w:t>server/routes/bookings.js</w:t>
+            </w:r>
+          </w:p>
+        </w:tc>
+        <w:tc>
+          <w:tcPr>
+            <w:tcW w:type="dxa" w:w="5669"/>
+            <w:vAlign w:val="center"/>
+          </w:tcPr>
+          <w:p>
+            <w:pPr>
+              <w:spacing w:line="360" w:lineRule="auto" w:before="20" w:after="20"/>
+              <w:jc w:val="left"/>
+            </w:pPr>
+            <w:r>
+              <w:rPr>
+                <w:rFonts w:ascii="Times New Roman" w:hAnsi="Times New Roman" w:cs="Times New Roman" w:eastAsia="Times New Roman"/>
+                <w:b w:val="0"/>
+                <w:i w:val="0"/>
+                <w:color w:val="000000"/>
+                <w:sz w:val="24"/>
+              </w:rPr>
+              <w:t>Создание заявки (POST /api/bookings), Telegram-уведомление</w:t>
+            </w:r>
+          </w:p>
+        </w:tc>
+      </w:tr>
+      <w:tr>
+        <w:trPr>
+          <w:cantSplit/>
+        </w:trPr>
+        <w:tc>
+          <w:tcPr>
+            <w:tcW w:type="dxa" w:w="3118"/>
+            <w:vAlign w:val="center"/>
+          </w:tcPr>
+          <w:p>
+            <w:pPr>
+              <w:spacing w:line="360" w:lineRule="auto" w:before="20" w:after="20"/>
+              <w:jc w:val="left"/>
+            </w:pPr>
+            <w:r>
+              <w:rPr>
+                <w:rFonts w:ascii="Courier New" w:hAnsi="Courier New" w:cs="Courier New" w:eastAsia="Courier New"/>
+                <w:color w:val="000000"/>
+                <w:sz w:val="22"/>
+              </w:rPr>
+              <w:t>server/routes/slots.js</w:t>
+            </w:r>
+          </w:p>
+        </w:tc>
+        <w:tc>
+          <w:tcPr>
+            <w:tcW w:type="dxa" w:w="5669"/>
+            <w:vAlign w:val="center"/>
+          </w:tcPr>
+          <w:p>
+            <w:pPr>
+              <w:spacing w:line="360" w:lineRule="auto" w:before="20" w:after="20"/>
+              <w:jc w:val="left"/>
+            </w:pPr>
+            <w:r>
+              <w:rPr>
+                <w:rFonts w:ascii="Times New Roman" w:hAnsi="Times New Roman" w:cs="Times New Roman" w:eastAsia="Times New Roman"/>
+                <w:b w:val="0"/>
+                <w:i w:val="0"/>
+                <w:color w:val="000000"/>
+                <w:sz w:val="24"/>
+              </w:rPr>
+              <w:t>Расчёт свободных слотов: blocked_dates → overrides → availability → bookings</w:t>
+            </w:r>
+          </w:p>
+        </w:tc>
+      </w:tr>
+      <w:tr>
+        <w:trPr>
+          <w:cantSplit/>
+        </w:trPr>
+        <w:tc>
+          <w:tcPr>
+            <w:tcW w:type="dxa" w:w="3118"/>
+            <w:vAlign w:val="center"/>
+          </w:tcPr>
+          <w:p>
+            <w:pPr>
+              <w:spacing w:line="360" w:lineRule="auto" w:before="20" w:after="20"/>
+              <w:jc w:val="left"/>
+            </w:pPr>
+            <w:r>
+              <w:rPr>
+                <w:rFonts w:ascii="Courier New" w:hAnsi="Courier New" w:cs="Courier New" w:eastAsia="Courier New"/>
+                <w:color w:val="000000"/>
+                <w:sz w:val="22"/>
+              </w:rPr>
+              <w:t>server/routes/client.js</w:t>
+            </w:r>
+          </w:p>
+        </w:tc>
+        <w:tc>
+          <w:tcPr>
+            <w:tcW w:type="dxa" w:w="5669"/>
+            <w:vAlign w:val="center"/>
+          </w:tcPr>
+          <w:p>
+            <w:pPr>
+              <w:spacing w:line="360" w:lineRule="auto" w:before="20" w:after="20"/>
+              <w:jc w:val="left"/>
+            </w:pPr>
+            <w:r>
+              <w:rPr>
+                <w:rFonts w:ascii="Times New Roman" w:hAnsi="Times New Roman" w:cs="Times New Roman" w:eastAsia="Times New Roman"/>
+                <w:b w:val="0"/>
+                <w:i w:val="0"/>
+                <w:color w:val="000000"/>
+                <w:sz w:val="24"/>
+              </w:rPr>
+              <w:t>Авторизация клиента, профиль, история записей, инбокс, Web Push</w:t>
+            </w:r>
+          </w:p>
+        </w:tc>
+      </w:tr>
+      <w:tr>
+        <w:trPr>
+          <w:cantSplit/>
+        </w:trPr>
+        <w:tc>
+          <w:tcPr>
+            <w:tcW w:type="dxa" w:w="3118"/>
+            <w:vAlign w:val="center"/>
+          </w:tcPr>
+          <w:p>
+            <w:pPr>
+              <w:spacing w:line="360" w:lineRule="auto" w:before="20" w:after="20"/>
+              <w:jc w:val="left"/>
+            </w:pPr>
+            <w:r>
+              <w:rPr>
+                <w:rFonts w:ascii="Courier New" w:hAnsi="Courier New" w:cs="Courier New" w:eastAsia="Courier New"/>
+                <w:color w:val="000000"/>
+                <w:sz w:val="22"/>
+              </w:rPr>
+              <w:t>database.sql</w:t>
+            </w:r>
+          </w:p>
+        </w:tc>
+        <w:tc>
+          <w:tcPr>
+            <w:tcW w:type="dxa" w:w="5669"/>
+            <w:vAlign w:val="center"/>
+          </w:tcPr>
+          <w:p>
+            <w:pPr>
+              <w:spacing w:line="360" w:lineRule="auto" w:before="20" w:after="20"/>
+              <w:jc w:val="left"/>
+            </w:pPr>
+            <w:r>
+              <w:rPr>
+                <w:rFonts w:ascii="Times New Roman" w:hAnsi="Times New Roman" w:cs="Times New Roman" w:eastAsia="Times New Roman"/>
+                <w:b w:val="0"/>
+                <w:i w:val="0"/>
+                <w:color w:val="000000"/>
+                <w:sz w:val="24"/>
+              </w:rPr>
+              <w:t>Схема базы данных (DDL) — создание всех таблиц и индексов</w:t>
+            </w:r>
+          </w:p>
+        </w:tc>
+      </w:tr>
+    </w:tbl>
+    <w:p>
+      <w:pPr>
+        <w:spacing w:line="360" w:lineRule="auto" w:before="120" w:after="80"/>
+        <w:ind w:firstLine="709"/>
+        <w:jc w:val="both"/>
+      </w:pPr>
+      <w:r>
+        <w:rPr>
+          <w:rFonts w:ascii="Times New Roman" w:hAnsi="Times New Roman" w:cs="Times New Roman" w:eastAsia="Times New Roman"/>
+          <w:b w:val="0"/>
+          <w:i w:val="0"/>
+          <w:color w:val="000000"/>
+          <w:sz w:val="28"/>
+        </w:rPr>
+        <w:t>Модули, отвечающие за функциональность панели администратора, приведены в таблице А.3.</w:t>
+      </w:r>
+    </w:p>
+    <w:p>
+      <w:pPr>
+        <w:spacing w:line="360" w:lineRule="auto" w:before="120" w:after="60"/>
+        <w:ind w:firstLine="0"/>
+        <w:jc w:val="left"/>
+      </w:pPr>
+      <w:r>
+        <w:rPr>
+          <w:rFonts w:ascii="Times New Roman" w:hAnsi="Times New Roman" w:cs="Times New Roman" w:eastAsia="Times New Roman"/>
+          <w:b w:val="0"/>
+          <w:i w:val="0"/>
+          <w:color w:val="000000"/>
+          <w:sz w:val="28"/>
+        </w:rPr>
+        <w:t>Таблица А.3 — Перечень модулей панели администратора</w:t>
+      </w:r>
+    </w:p>
+    <w:tbl>
+      <w:tblPr>
+        <w:tblStyle w:val="TableGrid"/>
+        <w:tblW w:type="auto" w:w="0"/>
+        <w:jc w:val="center"/>
+        <w:tblLook w:firstColumn="1" w:firstRow="1" w:lastColumn="0" w:lastRow="0" w:noHBand="0" w:noVBand="1" w:val="04A0"/>
+      </w:tblPr>
+      <w:tblGrid>
+        <w:gridCol w:w="4561"/>
+        <w:gridCol w:w="4561"/>
+      </w:tblGrid>
+      <w:tr>
+        <w:trPr>
+          <w:cantSplit/>
+        </w:trPr>
+        <w:tc>
+          <w:tcPr>
+            <w:tcW w:type="dxa" w:w="3118"/>
+            <w:vAlign w:val="center"/>
+            <w:shd w:val="clear" w:color="auto" w:fill="D9D9D9"/>
+          </w:tcPr>
+          <w:p>
+            <w:pPr>
+              <w:spacing w:line="360" w:lineRule="auto" w:before="40" w:after="40"/>
+              <w:jc w:val="center"/>
+            </w:pPr>
+            <w:r>
+              <w:rPr>
+                <w:rFonts w:ascii="Times New Roman" w:hAnsi="Times New Roman" w:cs="Times New Roman" w:eastAsia="Times New Roman"/>
+                <w:b/>
+                <w:i w:val="0"/>
+                <w:color w:val="000000"/>
+                <w:sz w:val="24"/>
+              </w:rPr>
+              <w:t>Наименование</w:t>
+            </w:r>
+          </w:p>
+        </w:tc>
+        <w:tc>
+          <w:tcPr>
+            <w:tcW w:type="dxa" w:w="5669"/>
+            <w:vAlign w:val="center"/>
+            <w:shd w:val="clear" w:color="auto" w:fill="D9D9D9"/>
+          </w:tcPr>
+          <w:p>
+            <w:pPr>
+              <w:spacing w:line="360" w:lineRule="auto" w:before="40" w:after="40"/>
+              <w:jc w:val="center"/>
+            </w:pPr>
+            <w:r>
+              <w:rPr>
+                <w:rFonts w:ascii="Times New Roman" w:hAnsi="Times New Roman" w:cs="Times New Roman" w:eastAsia="Times New Roman"/>
+                <w:b/>
+                <w:i w:val="0"/>
+                <w:color w:val="000000"/>
+                <w:sz w:val="24"/>
+              </w:rPr>
+              <w:t>Описание</w:t>
+            </w:r>
+          </w:p>
+        </w:tc>
+      </w:tr>
+      <w:tr>
+        <w:trPr>
+          <w:cantSplit/>
+        </w:trPr>
+        <w:tc>
+          <w:tcPr>
+            <w:tcW w:type="dxa" w:w="3118"/>
+            <w:vAlign w:val="center"/>
+          </w:tcPr>
+          <w:p>
+            <w:pPr>
+              <w:spacing w:line="360" w:lineRule="auto" w:before="20" w:after="20"/>
+              <w:jc w:val="left"/>
+            </w:pPr>
+            <w:r>
+              <w:rPr>
+                <w:rFonts w:ascii="Courier New" w:hAnsi="Courier New" w:cs="Courier New" w:eastAsia="Courier New"/>
+                <w:color w:val="000000"/>
+                <w:sz w:val="22"/>
+              </w:rPr>
+              <w:t>admin.html</w:t>
+            </w:r>
+          </w:p>
+        </w:tc>
+        <w:tc>
+          <w:tcPr>
+            <w:tcW w:type="dxa" w:w="5669"/>
+            <w:vAlign w:val="center"/>
+          </w:tcPr>
+          <w:p>
+            <w:pPr>
+              <w:spacing w:line="360" w:lineRule="auto" w:before="20" w:after="20"/>
+              <w:jc w:val="left"/>
+            </w:pPr>
+            <w:r>
+              <w:rPr>
+                <w:rFonts w:ascii="Times New Roman" w:hAnsi="Times New Roman" w:cs="Times New Roman" w:eastAsia="Times New Roman"/>
+                <w:b w:val="0"/>
+                <w:i w:val="0"/>
+                <w:color w:val="000000"/>
+                <w:sz w:val="24"/>
+              </w:rPr>
+              <w:t>HTML-интерфейс панели администратора</w:t>
+            </w:r>
+          </w:p>
+        </w:tc>
+      </w:tr>
+      <w:tr>
+        <w:trPr>
+          <w:cantSplit/>
+        </w:trPr>
+        <w:tc>
+          <w:tcPr>
+            <w:tcW w:type="dxa" w:w="3118"/>
+            <w:vAlign w:val="center"/>
+          </w:tcPr>
+          <w:p>
+            <w:pPr>
+              <w:spacing w:line="360" w:lineRule="auto" w:before="20" w:after="20"/>
+              <w:jc w:val="left"/>
+            </w:pPr>
+            <w:r>
+              <w:rPr>
+                <w:rFonts w:ascii="Courier New" w:hAnsi="Courier New" w:cs="Courier New" w:eastAsia="Courier New"/>
+                <w:color w:val="000000"/>
+                <w:sz w:val="22"/>
+              </w:rPr>
+              <w:t>css/admin.css</w:t>
+            </w:r>
+          </w:p>
+        </w:tc>
+        <w:tc>
+          <w:tcPr>
+            <w:tcW w:type="dxa" w:w="5669"/>
+            <w:vAlign w:val="center"/>
+          </w:tcPr>
+          <w:p>
+            <w:pPr>
+              <w:spacing w:line="360" w:lineRule="auto" w:before="20" w:after="20"/>
+              <w:jc w:val="left"/>
+            </w:pPr>
+            <w:r>
+              <w:rPr>
+                <w:rFonts w:ascii="Times New Roman" w:hAnsi="Times New Roman" w:cs="Times New Roman" w:eastAsia="Times New Roman"/>
+                <w:b w:val="0"/>
+                <w:i w:val="0"/>
+                <w:color w:val="000000"/>
+                <w:sz w:val="24"/>
+              </w:rPr>
+              <w:t>Стили панели администратора</w:t>
+            </w:r>
+          </w:p>
+        </w:tc>
+      </w:tr>
+      <w:tr>
+        <w:trPr>
+          <w:cantSplit/>
+        </w:trPr>
+        <w:tc>
+          <w:tcPr>
+            <w:tcW w:type="dxa" w:w="3118"/>
+            <w:vAlign w:val="center"/>
+          </w:tcPr>
+          <w:p>
+            <w:pPr>
+              <w:spacing w:line="360" w:lineRule="auto" w:before="20" w:after="20"/>
+              <w:jc w:val="left"/>
+            </w:pPr>
+            <w:r>
+              <w:rPr>
+                <w:rFonts w:ascii="Courier New" w:hAnsi="Courier New" w:cs="Courier New" w:eastAsia="Courier New"/>
+                <w:color w:val="000000"/>
+                <w:sz w:val="22"/>
+              </w:rPr>
+              <w:t>js/admin.js</w:t>
+            </w:r>
+          </w:p>
+        </w:tc>
+        <w:tc>
+          <w:tcPr>
+            <w:tcW w:type="dxa" w:w="5669"/>
+            <w:vAlign w:val="center"/>
+          </w:tcPr>
+          <w:p>
+            <w:pPr>
+              <w:spacing w:line="360" w:lineRule="auto" w:before="20" w:after="20"/>
+              <w:jc w:val="left"/>
+            </w:pPr>
+            <w:r>
+              <w:rPr>
+                <w:rFonts w:ascii="Times New Roman" w:hAnsi="Times New Roman" w:cs="Times New Roman" w:eastAsia="Times New Roman"/>
+                <w:b w:val="0"/>
+                <w:i w:val="0"/>
+                <w:color w:val="000000"/>
+                <w:sz w:val="24"/>
+              </w:rPr>
+              <w:t>CRUD записей, редактор расписания, блокировки дат, рассылка Web Push</w:t>
+            </w:r>
+          </w:p>
+        </w:tc>
+      </w:tr>
+      <w:tr>
+        <w:trPr>
+          <w:cantSplit/>
+        </w:trPr>
+        <w:tc>
+          <w:tcPr>
+            <w:tcW w:type="dxa" w:w="3118"/>
+            <w:vAlign w:val="center"/>
+          </w:tcPr>
+          <w:p>
+            <w:pPr>
+              <w:spacing w:line="360" w:lineRule="auto" w:before="20" w:after="20"/>
+              <w:jc w:val="left"/>
+            </w:pPr>
+            <w:r>
+              <w:rPr>
+                <w:rFonts w:ascii="Courier New" w:hAnsi="Courier New" w:cs="Courier New" w:eastAsia="Courier New"/>
+                <w:color w:val="000000"/>
+                <w:sz w:val="22"/>
+              </w:rPr>
+              <w:t>js/gallery-cms.js</w:t>
+            </w:r>
+          </w:p>
+        </w:tc>
+        <w:tc>
+          <w:tcPr>
+            <w:tcW w:type="dxa" w:w="5669"/>
+            <w:vAlign w:val="center"/>
+          </w:tcPr>
+          <w:p>
+            <w:pPr>
+              <w:spacing w:line="360" w:lineRule="auto" w:before="20" w:after="20"/>
+              <w:jc w:val="left"/>
+            </w:pPr>
+            <w:r>
+              <w:rPr>
+                <w:rFonts w:ascii="Times New Roman" w:hAnsi="Times New Roman" w:cs="Times New Roman" w:eastAsia="Times New Roman"/>
+                <w:b w:val="0"/>
+                <w:i w:val="0"/>
+                <w:color w:val="000000"/>
+                <w:sz w:val="24"/>
+              </w:rPr>
+              <w:t>Управление галереей портфолио из панели администратора</w:t>
+            </w:r>
+          </w:p>
+        </w:tc>
+      </w:tr>
+      <w:tr>
+        <w:trPr>
+          <w:cantSplit/>
+        </w:trPr>
+        <w:tc>
+          <w:tcPr>
+            <w:tcW w:type="dxa" w:w="3118"/>
+            <w:vAlign w:val="center"/>
+          </w:tcPr>
+          <w:p>
+            <w:pPr>
+              <w:spacing w:line="360" w:lineRule="auto" w:before="20" w:after="20"/>
+              <w:jc w:val="left"/>
+            </w:pPr>
+            <w:r>
+              <w:rPr>
+                <w:rFonts w:ascii="Courier New" w:hAnsi="Courier New" w:cs="Courier New" w:eastAsia="Courier New"/>
+                <w:color w:val="000000"/>
+                <w:sz w:val="22"/>
+              </w:rPr>
+              <w:t>server/routes/admin.js</w:t>
+            </w:r>
+          </w:p>
+        </w:tc>
+        <w:tc>
+          <w:tcPr>
+            <w:tcW w:type="dxa" w:w="5669"/>
+            <w:vAlign w:val="center"/>
+          </w:tcPr>
+          <w:p>
+            <w:pPr>
+              <w:spacing w:line="360" w:lineRule="auto" w:before="20" w:after="20"/>
+              <w:jc w:val="left"/>
+            </w:pPr>
+            <w:r>
+              <w:rPr>
+                <w:rFonts w:ascii="Times New Roman" w:hAnsi="Times New Roman" w:cs="Times New Roman" w:eastAsia="Times New Roman"/>
+                <w:b w:val="0"/>
+                <w:i w:val="0"/>
+                <w:color w:val="000000"/>
+                <w:sz w:val="24"/>
+              </w:rPr>
+              <w:t>API-маршруты администратора: записи, расписание, переопределения, Push</w:t>
+            </w:r>
+          </w:p>
+        </w:tc>
+      </w:tr>
+    </w:tbl>
+    <w:p>
+      <w:pPr>
+        <w:spacing w:before="0" w:after="0"/>
+      </w:pPr>
+      <w:r>
+        <w:br w:type="page"/>
+      </w:r>
+    </w:p>
+    <w:p>
+      <w:pPr>
+        <w:spacing w:line="360" w:lineRule="auto" w:before="0" w:after="80"/>
+        <w:ind w:firstLine="0"/>
+        <w:jc w:val="right"/>
+      </w:pPr>
+      <w:r>
+        <w:rPr>
+          <w:rFonts w:ascii="Times New Roman" w:hAnsi="Times New Roman" w:cs="Times New Roman" w:eastAsia="Times New Roman"/>
+          <w:b/>
+          <w:i w:val="0"/>
+          <w:color w:val="000000"/>
+          <w:sz w:val="28"/>
+        </w:rPr>
+        <w:t>ПРИЛОЖЕНИЕ В</w:t>
+      </w:r>
+    </w:p>
+    <w:p>
+      <w:pPr>
+        <w:spacing w:line="360" w:lineRule="auto" w:before="0" w:after="80"/>
+        <w:ind w:firstLine="0"/>
+        <w:jc w:val="center"/>
+      </w:pPr>
+      <w:r>
+        <w:rPr>
+          <w:rFonts w:ascii="Times New Roman" w:hAnsi="Times New Roman" w:cs="Times New Roman" w:eastAsia="Times New Roman"/>
+          <w:b/>
+          <w:i w:val="0"/>
+          <w:color w:val="000000"/>
+          <w:sz w:val="28"/>
+        </w:rPr>
+        <w:t>ТЕХНИЧЕСКОЕ ЗАДАНИЕ</w:t>
+      </w:r>
+    </w:p>
+    <w:p>
+      <w:pPr>
+        <w:spacing w:line="360" w:lineRule="auto" w:before="80" w:after="80"/>
+        <w:ind w:firstLine="0"/>
+        <w:jc w:val="center"/>
+      </w:pPr>
+      <w:r>
+        <w:rPr>
+          <w:rFonts w:ascii="Times New Roman" w:hAnsi="Times New Roman" w:cs="Times New Roman" w:eastAsia="Times New Roman"/>
+          <w:b/>
+          <w:i w:val="0"/>
+          <w:color w:val="000000"/>
+          <w:sz w:val="28"/>
+        </w:rPr>
+        <w:t>АННОТАЦИЯ</w:t>
+      </w:r>
+    </w:p>
+    <w:p>
+      <w:pPr>
+        <w:spacing w:line="360" w:lineRule="auto" w:before="0" w:after="0"/>
+        <w:ind w:firstLine="709"/>
+        <w:jc w:val="both"/>
+      </w:pPr>
+      <w:r>
+        <w:rPr>
+          <w:rFonts w:ascii="Times New Roman" w:hAnsi="Times New Roman" w:cs="Times New Roman" w:eastAsia="Times New Roman"/>
+          <w:b w:val="0"/>
+          <w:i w:val="0"/>
+          <w:color w:val="000000"/>
+          <w:sz w:val="28"/>
+        </w:rPr>
+        <w:t>Документ является техническим заданием на разработку веб-приложения для онлайн-записи в тату-студию REMNANT и составлен в соответствии с ГОСТ 34.602-89 «Техническое задание на создание автоматизированной системы».</w:t>
+      </w:r>
+    </w:p>
+    <w:p>
+      <w:pPr>
+        <w:spacing w:line="360" w:lineRule="auto" w:before="0" w:after="0"/>
+        <w:ind w:firstLine="709"/>
+        <w:jc w:val="both"/>
+      </w:pPr>
+      <w:r>
+        <w:rPr>
+          <w:rFonts w:ascii="Times New Roman" w:hAnsi="Times New Roman" w:cs="Times New Roman" w:eastAsia="Times New Roman"/>
+          <w:b w:val="0"/>
+          <w:i w:val="0"/>
+          <w:color w:val="000000"/>
+          <w:sz w:val="28"/>
+        </w:rPr>
+        <w:t>В техническом задании определены назначение и цели создания системы, требования к функциям и задачам, требования к техническому и программному обеспечению, требования к информационному обеспечению (структура базы данных, входные и выходные данные), а также требования к надёжности и безопасности.</w:t>
+      </w:r>
+    </w:p>
+    <w:p>
+      <w:pPr>
+        <w:spacing w:line="360" w:lineRule="auto" w:before="0" w:after="0"/>
+        <w:ind w:firstLine="709"/>
+        <w:jc w:val="both"/>
+      </w:pPr>
+      <w:r>
+        <w:rPr>
+          <w:rFonts w:ascii="Times New Roman" w:hAnsi="Times New Roman" w:cs="Times New Roman" w:eastAsia="Times New Roman"/>
+          <w:b w:val="0"/>
+          <w:i w:val="0"/>
+          <w:color w:val="000000"/>
+          <w:sz w:val="28"/>
+        </w:rPr>
+        <w:t>Документ содержит описание стадий и этапов разработки, порядок контроля и приёмки системы, требования к составу и содержанию работ по вводу системы в эксплуатацию. Техническое задание является основополагающим документом, определяющим границы разработки и критерии приёмки готового программного продукта.</w:t>
+      </w:r>
+    </w:p>
+    <w:p>
+      <w:pPr>
+        <w:spacing w:line="360" w:lineRule="auto" w:before="0" w:after="0"/>
+        <w:ind w:firstLine="709"/>
+        <w:jc w:val="both"/>
+      </w:pPr>
+      <w:r>
+        <w:rPr>
+          <w:rFonts w:ascii="Times New Roman" w:hAnsi="Times New Roman" w:cs="Times New Roman" w:eastAsia="Times New Roman"/>
+          <w:b w:val="0"/>
+          <w:i w:val="0"/>
+          <w:color w:val="000000"/>
+          <w:sz w:val="28"/>
+        </w:rPr>
+        <w:t>Документ адресован заказчику (ИП Гукасов Артур Самвелович), исполнителю (студент группы ВД50-2-22 Симпсон Уильям Джон) и членам государственной аттестационной комиссии.</w:t>
+      </w:r>
+    </w:p>
     <w:sectPr>
       <w:pgSz w:w="12240" w:h="15840"/>
       <w:pgMar w:top="1417" w:right="1134" w:bottom="1134" w:left="1984" w:header="720" w:footer="720" w:gutter="0"/>

</xml_diff>